<commit_message>
docs(cv): record HDR Ports & Maritime application submission
Submitted HDR req 196047 via Taleo on 2026-09-29. Resume and cover letter
now use achantav@gmail.com (VA edits); log records attachments, answers
confirmed by VA, and next checkpoint.

Co-Authored-By: Claude Opus 5.5 <noreply@anthropic.com>
</commit_message>
<xml_diff>
--- a/cv/va/custom/Vamsee Achanta_Project Manager_HDR Cover Letter.docx
+++ b/cv/va/custom/Vamsee Achanta_Project Manager_HDR Cover Letter.docx
@@ -84,16 +84,8 @@
                 <w:rPr>
                   <w:rStyle w:val="Hyperlink"/>
                 </w:rPr>
-                <w:t>linkedin.com/in/</w:t>
+                <w:t>linkedin.com/in/vamseeachanta</w:t>
               </w:r>
-              <w:proofErr w:type="spellStart"/>
-              <w:r>
-                <w:rPr>
-                  <w:rStyle w:val="Hyperlink"/>
-                </w:rPr>
-                <w:t>vamseeachanta</w:t>
-              </w:r>
-              <w:proofErr w:type="spellEnd"/>
             </w:hyperlink>
             <w:r>
               <w:t xml:space="preserve"> </w:t>
@@ -124,7 +116,7 @@
                 <w:rPr>
                   <w:rStyle w:val="Hyperlink"/>
                 </w:rPr>
-                <w:t>vamsee.achanta@aceengineer.com</w:t>
+                <w:t>achantav@gmail.com</w:t>
               </w:r>
             </w:hyperlink>
             <w:r>
@@ -137,7 +129,7 @@
           <w:p/>
           <w:p>
             <w:r>
-              <w:t xml:space="preserve">LOCATION:</w:t>
+              <w:t>LOCATION:</w:t>
             </w:r>
           </w:p>
           <w:p>
@@ -145,7 +137,7 @@
               <w:rPr>
                 <w:rStyle w:val="Hyperlink"/>
               </w:rPr>
-              <w:t xml:space="preserve">Houston, TX</w:t>
+              <w:t>Houston, TX</w:t>
             </w:r>
           </w:p>
         </w:tc>
@@ -216,15 +208,7 @@
               <w:jc w:val="both"/>
             </w:pPr>
             <w:r>
-              <w:t xml:space="preserve">At 2H Offshore, I managed delivery on more than 100 assignments, including the BP Macondo containment riser, where my 24/7 team delivered a complete design in eight weeks. As co-founder of FDAS and principal of </w:t>
-            </w:r>
-            <w:proofErr w:type="spellStart"/>
-            <w:r>
-              <w:t>AceEngineer</w:t>
-            </w:r>
-            <w:proofErr w:type="spellEnd"/>
-            <w:r>
-              <w:t>, I have owned budgets, staffing and full P&amp;L. I also build AI-assisted engineering workflows that support HDR's digital delivery goals.</w:t>
+              <w:t>At 2H Offshore, I managed delivery on more than 100 assignments, including the BP Macondo containment riser, where my 24/7 team delivered a complete design in eight weeks. As co-founder of FDAS and principal of AceEngineer, I have owned budgets, staffing and full P&amp;L. I also build AI-assisted engineering workflows that support HDR's digital delivery goals.</w:t>
             </w:r>
           </w:p>
           <w:p>
@@ -243,18 +227,19 @@
               <w:t xml:space="preserve">structural </w:t>
             </w:r>
             <w:r>
-              <w:t xml:space="preserve">and </w:t>
+              <w:t>and offshore</w:t>
             </w:r>
-            <w:proofErr w:type="gramStart"/>
             <w:r>
-              <w:t>offshore,</w:t>
+              <w:t>.</w:t>
             </w:r>
-            <w:proofErr w:type="gramEnd"/>
             <w:r>
               <w:t xml:space="preserve"> </w:t>
             </w:r>
             <w:r>
-              <w:t xml:space="preserve">however </w:t>
+              <w:t>H</w:t>
+            </w:r>
+            <w:r>
+              <w:t xml:space="preserve">owever </w:t>
             </w:r>
             <w:r>
               <w:t>I would rely on HDR's structural and coastal specialists while I manage scope, schedule, budget and clients.</w:t>
@@ -1947,12 +1932,15 @@
     <w:rsid w:val="000004BC"/>
     <w:rsid w:val="000C646A"/>
     <w:rsid w:val="00450E5C"/>
+    <w:rsid w:val="00462E67"/>
     <w:rsid w:val="004C1D1D"/>
     <w:rsid w:val="00716D59"/>
+    <w:rsid w:val="008A6633"/>
     <w:rsid w:val="00A47A09"/>
     <w:rsid w:val="00AA1009"/>
     <w:rsid w:val="00AB5A7D"/>
     <w:rsid w:val="00AE4F67"/>
+    <w:rsid w:val="00B701CB"/>
     <w:rsid w:val="00B81C25"/>
     <w:rsid w:val="00DD588A"/>
     <w:rsid w:val="00FD4583"/>
@@ -2430,9 +2418,6 @@
     <w:semiHidden/>
     <w:unhideWhenUsed/>
   </w:style>
-  <w:style w:type="paragraph" w:customStyle="1" w:styleId="BA8473776C294F4EA8C2AC7CA4BAF7D4">
-    <w:name w:val="BA8473776C294F4EA8C2AC7CA4BAF7D4"/>
-  </w:style>
   <w:style w:type="paragraph" w:customStyle="1" w:styleId="1092122E14F041BF8891B4BF947D45B1">
     <w:name w:val="1092122E14F041BF8891B4BF947D45B1"/>
   </w:style>
@@ -2451,12 +2436,6 @@
       <w:color w:val="BF4E14" w:themeColor="accent2" w:themeShade="BF"/>
       <w:u w:val="single"/>
     </w:rPr>
-  </w:style>
-  <w:style w:type="paragraph" w:customStyle="1" w:styleId="BD84B9738FB74854BE0D8991FC5CE150">
-    <w:name w:val="BD84B9738FB74854BE0D8991FC5CE150"/>
-  </w:style>
-  <w:style w:type="paragraph" w:customStyle="1" w:styleId="E9D1AE085E1E4BEA9324360A59290972">
-    <w:name w:val="E9D1AE085E1E4BEA9324360A59290972"/>
   </w:style>
   <w:style w:type="character" w:customStyle="1" w:styleId="Heading2Char">
     <w:name w:val="Heading 2 Char"/>
@@ -2745,19 +2724,6 @@
 </file>
 
 <file path=customXml/item1.xml><?xml version="1.0" encoding="utf-8"?>
-<?mso-contentType ?>
-<FormTemplates xmlns="http://schemas.microsoft.com/sharepoint/v3/contenttype/forms">
-  <Display>DocumentLibraryForm</Display>
-  <Edit>DocumentLibraryForm</Edit>
-  <New>DocumentLibraryForm</New>
-</FormTemplates>
-</file>
-
-<file path=customXml/item2.xml><?xml version="1.0" encoding="utf-8"?>
-<b:Sources xmlns:b="http://schemas.openxmlformats.org/officeDocument/2006/bibliography" xmlns="http://schemas.openxmlformats.org/officeDocument/2006/bibliography" SelectedStyle="\APASixthEditionOfficeOnline.xsl" StyleName="APA" Version="6"/>
-</file>
-
-<file path=customXml/item3.xml><?xml version="1.0" encoding="utf-8"?>
 <ct:contentTypeSchema xmlns:ct="http://schemas.microsoft.com/office/2006/metadata/contentType" xmlns:ma="http://schemas.microsoft.com/office/2006/metadata/properties/metaAttributes" ct:_="" ma:_="" ma:contentTypeName="Document" ma:contentTypeID="0x01010079F111ED35F8CC479449609E8A0923A6" ma:contentTypeVersion="11" ma:contentTypeDescription="Create a new document." ma:contentTypeScope="" ma:versionID="1c2eb7a32e66fb6e4260f3771546a5e2">
   <xsd:schema xmlns:xsd="http://www.w3.org/2001/XMLSchema" xmlns:xs="http://www.w3.org/2001/XMLSchema" xmlns:p="http://schemas.microsoft.com/office/2006/metadata/properties" xmlns:ns2="71af3243-3dd4-4a8d-8c0d-dd76da1f02a5" xmlns:ns3="16c05727-aa75-4e4a-9b5f-8a80a1165891" targetNamespace="http://schemas.microsoft.com/office/2006/metadata/properties" ma:root="true" ma:fieldsID="04e1f6479c48b08974ba73b5ca973489" ns2:_="" ns3:_="">
     <xsd:import namespace="71af3243-3dd4-4a8d-8c0d-dd76da1f02a5"/>
@@ -2968,7 +2934,7 @@
 </ct:contentTypeSchema>
 </file>
 
-<file path=customXml/item4.xml><?xml version="1.0" encoding="utf-8"?>
+<file path=customXml/item2.xml><?xml version="1.0" encoding="utf-8"?>
 <p:properties xmlns:p="http://schemas.microsoft.com/office/2006/metadata/properties" xmlns:xsi="http://www.w3.org/2001/XMLSchema-instance" xmlns:pc="http://schemas.microsoft.com/office/infopath/2007/PartnerControls">
   <documentManagement>
     <MediaServiceKeyPoints xmlns="71af3243-3dd4-4a8d-8c0d-dd76da1f02a5">Internship experience at Novartis</MediaServiceKeyPoints>
@@ -2976,23 +2942,20 @@
 </p:properties>
 </file>
 
-<file path=customXml/itemProps1.xml><?xml version="1.0" encoding="utf-8"?>
-<ds:datastoreItem xmlns:ds="http://schemas.openxmlformats.org/officeDocument/2006/customXml" ds:itemID="{18506A0D-4821-47C2-BD9B-CACF27C6B108}">
-  <ds:schemaRefs>
-    <ds:schemaRef ds:uri="http://schemas.microsoft.com/sharepoint/v3/contenttype/forms"/>
-  </ds:schemaRefs>
-</ds:datastoreItem>
+<file path=customXml/item3.xml><?xml version="1.0" encoding="utf-8"?>
+<?mso-contentType ?>
+<FormTemplates xmlns="http://schemas.microsoft.com/sharepoint/v3/contenttype/forms">
+  <Display>DocumentLibraryForm</Display>
+  <Edit>DocumentLibraryForm</Edit>
+  <New>DocumentLibraryForm</New>
+</FormTemplates>
 </file>
 
-<file path=customXml/itemProps2.xml><?xml version="1.0" encoding="utf-8"?>
-<ds:datastoreItem xmlns:ds="http://schemas.openxmlformats.org/officeDocument/2006/customXml" ds:itemID="{4BD957D2-1828-4AEA-8C3E-B39D0FE36703}">
-  <ds:schemaRefs>
-    <ds:schemaRef ds:uri="http://schemas.openxmlformats.org/officeDocument/2006/bibliography"/>
-  </ds:schemaRefs>
-</ds:datastoreItem>
+<file path=customXml/item4.xml><?xml version="1.0" encoding="utf-8"?>
+<b:Sources xmlns:b="http://schemas.openxmlformats.org/officeDocument/2006/bibliography" xmlns="http://schemas.openxmlformats.org/officeDocument/2006/bibliography" SelectedStyle="\APASixthEditionOfficeOnline.xsl" StyleName="APA" Version="6"/>
 </file>
 
-<file path=customXml/itemProps3.xml><?xml version="1.0" encoding="utf-8"?>
+<file path=customXml/itemProps1.xml><?xml version="1.0" encoding="utf-8"?>
 <ds:datastoreItem xmlns:ds="http://schemas.openxmlformats.org/officeDocument/2006/customXml" ds:itemID="{8143E149-BD72-41A7-8F13-AF59DE30D6FA}">
   <ds:schemaRefs>
     <ds:schemaRef ds:uri="http://schemas.microsoft.com/office/2006/metadata/contentType"/>
@@ -3011,7 +2974,7 @@
 </ds:datastoreItem>
 </file>
 
-<file path=customXml/itemProps4.xml><?xml version="1.0" encoding="utf-8"?>
+<file path=customXml/itemProps2.xml><?xml version="1.0" encoding="utf-8"?>
 <ds:datastoreItem xmlns:ds="http://schemas.openxmlformats.org/officeDocument/2006/customXml" ds:itemID="{DD14EC26-251D-443A-AF4F-B15D0F3B0F84}">
   <ds:schemaRefs>
     <ds:schemaRef ds:uri="http://schemas.microsoft.com/office/2006/metadata/properties"/>
@@ -3021,6 +2984,22 @@
 </ds:datastoreItem>
 </file>
 
+<file path=customXml/itemProps3.xml><?xml version="1.0" encoding="utf-8"?>
+<ds:datastoreItem xmlns:ds="http://schemas.openxmlformats.org/officeDocument/2006/customXml" ds:itemID="{18506A0D-4821-47C2-BD9B-CACF27C6B108}">
+  <ds:schemaRefs>
+    <ds:schemaRef ds:uri="http://schemas.microsoft.com/sharepoint/v3/contenttype/forms"/>
+  </ds:schemaRefs>
+</ds:datastoreItem>
+</file>
+
+<file path=customXml/itemProps4.xml><?xml version="1.0" encoding="utf-8"?>
+<ds:datastoreItem xmlns:ds="http://schemas.openxmlformats.org/officeDocument/2006/customXml" ds:itemID="{4BD957D2-1828-4AEA-8C3E-B39D0FE36703}">
+  <ds:schemaRefs>
+    <ds:schemaRef ds:uri="http://schemas.openxmlformats.org/officeDocument/2006/bibliography"/>
+  </ds:schemaRefs>
+</ds:datastoreItem>
+</file>
+
 <file path=docMetadata/LabelInfo.xml><?xml version="1.0" encoding="utf-8"?>
 <clbl:labelList xmlns:clbl="http://schemas.microsoft.com/office/2020/mipLabelMetadata">
   <clbl:label id="{5563d9c4-1af6-4d5e-894d-8f5a4315f709}" enabled="1" method="Privileged" siteId="{3667e201-cbdc-48b3-9b42-5d2d3f16e2a9}" contentBits="0" removed="0"/>

</xml_diff>